<commit_message>
fix: Noite 6 - roteadores de fabrica (Wi-Fi pela etiqueta, senha de admin criada no Bloco 5)
Co-Authored-By: Claude Opus 5.5 <noreply@anthropic.com>
Claude-Session: https://claude.ai/code/session_014d2FCU4ZD84rtzS7r1bjwe
</commit_message>
<xml_diff>
--- a/Folha do Aluno - Redes 6 - Endereco na rede.docx
+++ b/Folha do Aluno - Redes 6 - Endereco na rede.docx
@@ -791,7 +791,7 @@
           <w:color w:val="555555"/>
           <w:sz w:val="20"/>
         </w:rPr>
-        <w:t>No navegador do celular, digite o endereço do gateway (192.168.0.1). Entre com a senha que o professor passar e ache a lista de aparelhos. Hoje NÃO se muda nada — só olhar e anotar.</w:t>
+        <w:t>No navegador do celular, digite o endereço do gateway (192.168.0.1). No primeiro acesso, crie a senha de administrador que o professor ditar (se abrir o assistente de configuração, pule). Ache a lista de aparelhos. Fora a senha, hoje NÃO se muda nada — só olhar e anotar.</w:t>
       </w:r>
     </w:p>
     <w:p>
@@ -799,7 +799,7 @@
         <w:rPr>
           <w:sz w:val="22"/>
         </w:rPr>
-        <w:t>Nome do Wi-Fi da equipe: ____________________    Modelo do roteador: ____________________</w:t>
+        <w:t>Nome do Wi-Fi (da etiqueta): ____________________    Modelo do roteador: ____________________</w:t>
       </w:r>
     </w:p>
     <w:p>

</xml_diff>